<commit_message>
Contrarrazões aos embargos (v2): incorpora precedentes, multa e tutela da v1 do escritório
Co-Authored-By: Claude Opus 5.5 <noreply@anthropic.com>
Claude-Session: https://claude.ai/code/session_01HGwRciqyTiQSvfsnHtndrt
</commit_message>
<xml_diff>
--- a/0800052-74.2026 - Jorge Marques/Contrarrazões aos Embargos de Declaração - Jorge Marques de Araújo.docx
+++ b/0800052-74.2026 - Jorge Marques/Contrarrazões aos Embargos de Declaração - Jorge Marques de Araújo.docx
@@ -75,7 +75,37 @@
         <w:t xml:space="preserve">JORGE MARQUES DE ARAÚJO,</w:t>
       </w:r>
       <w:r>
-        <w:t xml:space="preserve"> já qualificado nos autos em epígrafe, por meio de seu advogado, ANTÔNIO DE PÁDUA SANTOS NETO, inscrito na OAB-PI sob o nº 21.320, com endereço profissional na Rua Rio Grande do Sul, nº 1641, Bairro São Miguel, Miguel Alves-PI, CEP nº 64.130-000, e eletrônico </w:t>
+        <w:t xml:space="preserve"> já qualificado nos autos dos </w:t>
+      </w:r>
+      <w:r>
+        <w:rPr>
+          <w:b/>
+          <w:bCs/>
+        </w:rPr>
+        <w:t xml:space="preserve">EMBARGOS DE TERCEIRO</w:t>
+      </w:r>
+      <w:r>
+        <w:t xml:space="preserve"> que move em face de </w:t>
+      </w:r>
+      <w:r>
+        <w:rPr>
+          <w:b/>
+          <w:bCs/>
+        </w:rPr>
+        <w:t xml:space="preserve">BANCO DO NORDESTE DO BRASIL S.A.</w:t>
+      </w:r>
+      <w:r>
+        <w:t xml:space="preserve"> e </w:t>
+      </w:r>
+      <w:r>
+        <w:rPr>
+          <w:b/>
+          <w:bCs/>
+        </w:rPr>
+        <w:t xml:space="preserve">WELLINGTON MOURA SANTOS</w:t>
+      </w:r>
+      <w:r>
+        <w:t xml:space="preserve">, por meio de seu advogado, ANTÔNIO DE PÁDUA SANTOS NETO, inscrito na OAB-PI sob o nº 21.320, com endereço profissional na Rua Rio Grande do Sul, nº 1641, Bairro São Miguel, Miguel Alves-PI, CEP nº 64.130-000, e eletrônico </w:t>
       </w:r>
       <w:r>
         <w:rPr>
@@ -118,17 +148,17 @@
         <w:jc w:val="both"/>
       </w:pPr>
       <w:r>
-        <w:t xml:space="preserve">opostos pelo </w:t>
-      </w:r>
-      <w:r>
-        <w:rPr>
-          <w:b/>
-          <w:bCs/>
-        </w:rPr>
-        <w:t xml:space="preserve">BANCO DO NORDESTE DO BRASIL S.A.</w:t>
-      </w:r>
-      <w:r>
-        <w:t xml:space="preserve"> (ID 59518412) contra o acórdão de ID 59113701, pelas razões de fato e de direito a seguir expostas.</w:t>
+        <w:t xml:space="preserve">opostos pelo Banco do Nordeste do Brasil S.A. (ID 59518412) contra o acórdão de ID 59113701, cumulada com </w:t>
+      </w:r>
+      <w:r>
+        <w:rPr>
+          <w:b/>
+          <w:bCs/>
+        </w:rPr>
+        <w:t xml:space="preserve">pedido de tutela provisória</w:t>
+      </w:r>
+      <w:r>
+        <w:t xml:space="preserve"> para impedir a apreensão do veículo objeto da demanda, pelas razões de fato e de direito a seguir expostas.</w:t>
       </w:r>
     </w:p>
     <w:p>
@@ -216,27 +246,47 @@
           <w:iCs/>
           <w:color w:val="FFFFFF"/>
         </w:rPr>
-        <w:t xml:space="preserve">II. Síntese dos embargos.</w:t>
-      </w:r>
-    </w:p>
-    <w:p>
-      <w:pPr>
-        <w:spacing w:after="60" w:line="360"/>
-        <w:ind w:firstLine="850"/>
-        <w:jc w:val="both"/>
-      </w:pPr>
-      <w:r>
-        <w:t xml:space="preserve">O acórdão embargado, por unanimidade, deu provimento à apelação do embargado para reformar a sentença, conceder-lhe a gratuidade da justiça e determinar o retorno dos autos à origem para regular prosseguimento dos embargos de terceiro.</w:t>
-      </w:r>
-    </w:p>
-    <w:p>
-      <w:pPr>
-        <w:spacing w:after="60" w:line="360"/>
-        <w:ind w:firstLine="850"/>
-        <w:jc w:val="both"/>
-      </w:pPr>
-      <w:r>
-        <w:t xml:space="preserve">Inconformado, o Banco do Nordeste opôs embargos de declaração apontando dois supostos vícios: (i) </w:t>
+        <w:t xml:space="preserve">II. Síntese necessária.</w:t>
+      </w:r>
+    </w:p>
+    <w:p>
+      <w:pPr>
+        <w:spacing w:after="60" w:line="360"/>
+        <w:ind w:firstLine="850"/>
+        <w:jc w:val="both"/>
+      </w:pPr>
+      <w:r>
+        <w:t xml:space="preserve">A sentença (ID 56302139) indeferiu a petição inicial e extinguiu o processo sem resolução do mérito, sob o fundamento de que o embargado não teria atendido à determinação de comprovação da hipossuficiência, nem recolhido as custas, e de que possuiria “vultuosa movimentação financeira”.</w:t>
+      </w:r>
+    </w:p>
+    <w:p>
+      <w:pPr>
+        <w:spacing w:after="60" w:line="360"/>
+        <w:ind w:firstLine="850"/>
+        <w:jc w:val="both"/>
+      </w:pPr>
+      <w:r>
+        <w:t xml:space="preserve">Interposta apelação, o acórdão, por unanimidade, reconheceu que houve manifestação protocolada em 12/03/2026, acompanhada de documentos, afastou a premissa de inércia processual, constatou que a movimentação bancária não revela capacidade econômica, </w:t>
+      </w:r>
+      <w:r>
+        <w:rPr>
+          <w:b/>
+          <w:bCs/>
+        </w:rPr>
+        <w:t xml:space="preserve">concedeu a gratuidade da justiça</w:t>
+      </w:r>
+      <w:r>
+        <w:t xml:space="preserve"> e determinou o retorno dos autos à origem para regular prosseguimento.</w:t>
+      </w:r>
+    </w:p>
+    <w:p>
+      <w:pPr>
+        <w:spacing w:after="60" w:line="360"/>
+        <w:ind w:firstLine="850"/>
+        <w:jc w:val="both"/>
+      </w:pPr>
+      <w:r>
+        <w:t xml:space="preserve">O Banco opôs embargos de declaração alegando, de um lado, </w:t>
       </w:r>
       <w:r>
         <w:rPr>
@@ -246,7 +296,7 @@
         <w:t xml:space="preserve">contradição</w:t>
       </w:r>
       <w:r>
-        <w:t xml:space="preserve"> entre o dispositivo formal do acórdão, que registrou “negar-lhe provimento”, e a ementa, o voto e a certidão de julgamento, que consignam o provimento do recurso; e (ii) </w:t>
+        <w:t xml:space="preserve"> entre a ementa, o voto e a certidão de julgamento — que registram o provimento do recurso — e o dispositivo formal, que contém a expressão “negar-lhe provimento”. De outro, pretende transformar em </w:t>
       </w:r>
       <w:r>
         <w:rPr>
@@ -256,17 +306,17 @@
         <w:t xml:space="preserve">omissão</w:t>
       </w:r>
       <w:r>
-        <w:t xml:space="preserve"> quanto à tempestividade da petição protocolada em 12/03/2026, em atendimento ao despacho de 05/02/2026. Com base nesse segundo ponto, requer a atribuição de efeitos infringentes, “caso seja constatado que a manifestação foi apresentada fora do prazo”.</w:t>
-      </w:r>
-    </w:p>
-    <w:p>
-      <w:pPr>
-        <w:spacing w:after="60" w:line="360"/>
-        <w:ind w:firstLine="850"/>
-        <w:jc w:val="both"/>
-      </w:pPr>
-      <w:r>
-        <w:t xml:space="preserve">Como se demonstrará, o primeiro ponto revela mero </w:t>
+        <w:t xml:space="preserve"> a discussão sobre a tempestividade da manifestação de 12/03/2026, buscando efeitos modificativos para restabelecer a extinção do feito.</w:t>
+      </w:r>
+    </w:p>
+    <w:p>
+      <w:pPr>
+        <w:spacing w:after="60" w:line="360"/>
+        <w:ind w:firstLine="850"/>
+        <w:jc w:val="both"/>
+      </w:pPr>
+      <w:r>
+        <w:t xml:space="preserve">A primeira questão resolve-se como mera correção de </w:t>
       </w:r>
       <w:r>
         <w:rPr>
@@ -276,7 +326,7 @@
         <w:t xml:space="preserve">erro material</w:t>
       </w:r>
       <w:r>
-        <w:t xml:space="preserve">, cuja correção apenas confirma o resultado efetivamente proclamado em favor do embargado; o segundo não configura omissão, mas tentativa de inovar na causa e rediscutir o mérito do julgado, o que é vedado na via eleita.</w:t>
+        <w:t xml:space="preserve">, que apenas confirma o resultado proclamado em favor do embargado. A segunda não configura omissão: traduz tentativa de introduzir fundamento novo e rediscutir matéria já decidida, o que é vedado na via eleita.</w:t>
       </w:r>
     </w:p>
     <w:p>
@@ -316,7 +366,7 @@
         <w:jc w:val="both"/>
       </w:pPr>
       <w:r>
-        <w:t xml:space="preserve">Assiste razão ao embargante apenas quanto à constatação de que o campo “Decisão (Acórdão)” registrou, por evidente equívoco de digitação, que a Câmara teria decidido “conhecer do recurso e no mérito negar-lhe provimento”.</w:t>
+        <w:t xml:space="preserve">O embargado não se opõe à correção da expressão “negar-lhe provimento”, constante do campo “Decisão (Acórdão)”, que decorre de evidente equívoco de digitação.</w:t>
       </w:r>
     </w:p>
     <w:p>
@@ -376,37 +426,7 @@
         <w:t xml:space="preserve">erro material</w:t>
       </w:r>
       <w:r>
-        <w:t xml:space="preserve">, e não de contradição na formação do convencimento do colegiado. O resultado proclamado na sessão virtual de 09 a 16/09/2026 foi o provimento do recurso, e é esse o resultado que deve constar do dispositivo. A correção pode ser feita a qualquer tempo, inclusive de ofício, nos termos dos arts. 494, I, e 1.022, III, do CPC, e não autoriza qualquer alteração do conteúdo decisório.</w:t>
-      </w:r>
-    </w:p>
-    <w:p>
-      <w:pPr>
-        <w:spacing w:after="60" w:line="360"/>
-        <w:ind w:firstLine="850"/>
-        <w:jc w:val="both"/>
-      </w:pPr>
-      <w:r>
-        <w:t xml:space="preserve">O embargado, portanto, </w:t>
-      </w:r>
-      <w:r>
-        <w:rPr>
-          <w:b/>
-          <w:bCs/>
-        </w:rPr>
-        <w:t xml:space="preserve">concorda com a correção</w:t>
-      </w:r>
-      <w:r>
-        <w:t xml:space="preserve">, desde que restrita a adequar o dispositivo ao resultado efetivamente proclamado, passando a constar que os Desembargadores acordam, por unanimidade, em </w:t>
-      </w:r>
-      <w:r>
-        <w:rPr>
-          <w:b/>
-          <w:bCs/>
-        </w:rPr>
-        <w:t xml:space="preserve">conhecer do recurso e, no mérito, dar-lhe provimento</w:t>
-      </w:r>
-      <w:r>
-        <w:t xml:space="preserve">, nos termos do voto do Relator.</w:t>
+        <w:t xml:space="preserve">, e não de contradição na formação do convencimento do colegiado. A correção pode ser feita a qualquer tempo, inclusive de ofício (arts. 494, I, e 1.022, III, do CPC), e deve limitar-se a adequar o dispositivo ao resultado efetivamente proclamado — provimento da apelação, concessão da gratuidade e retorno dos autos à origem —, sem reabrir o mérito ou restabelecer a sentença.</w:t>
       </w:r>
     </w:p>
     <w:p>
@@ -473,7 +493,7 @@
           <w:i/>
           <w:iCs/>
         </w:rPr>
-        <w:t xml:space="preserve">A questão jamais foi suscitada pelo embargante:</w:t>
+        <w:t xml:space="preserve">Inovação recursal: a questão jamais foi suscitada pelo embargante:</w:t>
       </w:r>
     </w:p>
     <w:p>
@@ -513,7 +533,7 @@
         <w:t xml:space="preserve">em nenhum momento alegou a intempestividade</w:t>
       </w:r>
       <w:r>
-        <w:t xml:space="preserve"> da manifestação do apelante. Ao contrário, tratou a petição e os documentos como regularmente apresentados e limitou-se a sustentar que a prova seria insuficiente:</w:t>
+        <w:t xml:space="preserve"> da manifestação do apelante. Ao contrário, tratou a petição e os documentos como regularmente apresentados e concentrou sua insurgência na alegada insuficiência da prova:</w:t>
       </w:r>
     </w:p>
     <w:p>
@@ -565,7 +585,7 @@
         <w:jc w:val="both"/>
       </w:pPr>
       <w:r>
-        <w:t xml:space="preserve">O próprio embargante, aliás, dedicou parte das contrarrazões a valorar o conteúdo dos extratos apresentados pelo apelante — afirmando que “</w:t>
+        <w:t xml:space="preserve">O próprio embargante, aliás, dedicou parte das contrarrazões a valorar o conteúdo dos extratos apresentados — afirmando que “</w:t>
       </w:r>
       <w:r>
         <w:rPr>
@@ -595,7 +615,203 @@
         <w:t xml:space="preserve">inovação recursal</w:t>
       </w:r>
       <w:r>
-        <w:t xml:space="preserve">, incompatível com a natureza integrativa do recurso, que não se presta a introduzir argumentos novos que a parte deixou de deduzir no momento oportuno. Não há como o colegiado ter sido omisso sobre questão que jamais lhe foi apresentada.</w:t>
+        <w:t xml:space="preserve">, alcançada pela preclusão consumativa, como reiteradamente decide o Superior Tribunal de Justiça:</w:t>
+      </w:r>
+    </w:p>
+    <w:p>
+      <w:pPr>
+        <w:pBdr>
+          <w:top w:val="single" w:color="9AA0A6" w:sz="4" w:space="6"/>
+        </w:pBdr>
+        <w:spacing w:after="0" w:before="160" w:line="240"/>
+        <w:ind w:left="2270" w:right="570"/>
+        <w:jc w:val="both"/>
+      </w:pPr>
+      <w:r>
+        <w:rPr>
+          <w:sz w:val="18"/>
+          <w:szCs w:val="18"/>
+        </w:rPr>
+        <w:t xml:space="preserve">PROCESSUAL CIVIL. EMBARGOS DE DECLARAÇÃO NO AGRAVO INTERNO NO RECURSO ESPECIAL. OMISSÃO QUANTO À APLICAÇÃO DO TEMA 995/STJ QUANDO A REAFIRMAÇÃO DA DER OCORRE ANTES DA CITAÇÃO. INOVAÇÃO RECURSAL. PRECLUSÃO CONSUMATIVA. EMBARGOS DE DECLARAÇÃO DO PARTICULAR NÃO CONHECIDOS. 1. </w:t>
+      </w:r>
+      <w:r>
+        <w:rPr>
+          <w:b/>
+          <w:bCs/>
+          <w:u w:val="single"/>
+          <w:shd w:fill="CFE2F3" w:color="auto" w:val="clear"/>
+          <w:sz w:val="18"/>
+          <w:szCs w:val="18"/>
+        </w:rPr>
+        <w:t xml:space="preserve">A argumentação trazida somente por ocasião do manejo dos embargos de declaração caracteriza indevida inovação recursal e impede o conhecimento da insurgência, tendo em vista a ocorrência da preclusão consumativa.</w:t>
+      </w:r>
+      <w:r>
+        <w:rPr>
+          <w:sz w:val="18"/>
+          <w:szCs w:val="18"/>
+        </w:rPr>
+        <w:t xml:space="preserve"> 2. Embargos de declaração do particular não conhecidos.</w:t>
+      </w:r>
+    </w:p>
+    <w:p>
+      <w:pPr>
+        <w:pBdr>
+          <w:bottom w:val="single" w:color="9AA0A6" w:sz="4" w:space="6"/>
+        </w:pBdr>
+        <w:spacing w:after="200" w:before="0" w:line="240"/>
+        <w:ind w:left="2270" w:right="570"/>
+        <w:jc w:val="both"/>
+      </w:pPr>
+      <w:r>
+        <w:rPr>
+          <w:sz w:val="18"/>
+          <w:szCs w:val="18"/>
+        </w:rPr>
+        <w:t xml:space="preserve">(STJ - EDcl no AgInt no REsp 1.933.348/SC, Rel. Min. Manoel Erhardt (Desembargador convocado do TRF5), Primeira Turma, j. 28/03/2022, DJe 30/03/2022)</w:t>
+      </w:r>
+    </w:p>
+    <w:p>
+      <w:pPr>
+        <w:pBdr>
+          <w:top w:val="single" w:color="9AA0A6" w:sz="4" w:space="6"/>
+        </w:pBdr>
+        <w:spacing w:after="0" w:before="160" w:line="240"/>
+        <w:ind w:left="2270" w:right="570"/>
+        <w:jc w:val="both"/>
+      </w:pPr>
+      <w:r>
+        <w:rPr>
+          <w:sz w:val="18"/>
+          <w:szCs w:val="18"/>
+        </w:rPr>
+        <w:t xml:space="preserve">PROCESSUAL CIVIL. EMBARGOS DE DECLARAÇÃO NO AGRAVO INTERNO NO RECURSO ESPECIAL. AUSÊNCIA DE OMISSÃO, OBSCURIDADE OU CONTRADIÇÃO. MERO INCONFORMISMO DA PARTE EMBARGANTE. […] 1. Os embargos de declaração destinam-se a esclarecer obscuridade, eliminar contradição, suprir omissão ou corrigir erro material existente no julgado (art. 1.022 do CPC/2015). 2. </w:t>
+      </w:r>
+      <w:r>
+        <w:rPr>
+          <w:b/>
+          <w:bCs/>
+          <w:u w:val="single"/>
+          <w:shd w:fill="CFE2F3" w:color="auto" w:val="clear"/>
+          <w:sz w:val="18"/>
+          <w:szCs w:val="18"/>
+        </w:rPr>
+        <w:t xml:space="preserve">Inviável a análise de tese apresentada somente em sede de embargos de declaração, porquanto incabível a inovação recursal em embargos de declaração, pela preclusão consumativa.</w:t>
+      </w:r>
+      <w:r>
+        <w:rPr>
+          <w:sz w:val="18"/>
+          <w:szCs w:val="18"/>
+        </w:rPr>
+        <w:t xml:space="preserve"> 3. Os aclaratórios têm finalidade integrativa, por isso não se prestam a revisar questões já decididas para alterar entendimento anteriormente aplicado. […] 5. Embargos de declaração rejeitados.</w:t>
+      </w:r>
+    </w:p>
+    <w:p>
+      <w:pPr>
+        <w:pBdr>
+          <w:bottom w:val="single" w:color="9AA0A6" w:sz="4" w:space="6"/>
+        </w:pBdr>
+        <w:spacing w:after="200" w:before="0" w:line="240"/>
+        <w:ind w:left="2270" w:right="570"/>
+        <w:jc w:val="both"/>
+      </w:pPr>
+      <w:r>
+        <w:rPr>
+          <w:sz w:val="18"/>
+          <w:szCs w:val="18"/>
+        </w:rPr>
+        <w:t xml:space="preserve">(STJ - EDcl no AgInt no REsp 2.022.551/PR, Rel. Min. João Otávio de Noronha, Quarta Turma, j. 12/06/2023, DJe 15/06/2023)</w:t>
+      </w:r>
+    </w:p>
+    <w:p>
+      <w:pPr>
+        <w:spacing w:after="60" w:line="360"/>
+        <w:ind w:firstLine="850"/>
+        <w:jc w:val="both"/>
+      </w:pPr>
+      <w:r>
+        <w:t xml:space="preserve">No mesmo sentido é a orientação deste Egrégio Tribunal de Justiça:</w:t>
+      </w:r>
+    </w:p>
+    <w:p>
+      <w:pPr>
+        <w:pBdr>
+          <w:top w:val="single" w:color="9AA0A6" w:sz="4" w:space="6"/>
+        </w:pBdr>
+        <w:spacing w:after="0" w:before="160" w:line="240"/>
+        <w:ind w:left="2270" w:right="570"/>
+        <w:jc w:val="both"/>
+      </w:pPr>
+      <w:r>
+        <w:rPr>
+          <w:sz w:val="18"/>
+          <w:szCs w:val="18"/>
+        </w:rPr>
+        <w:t xml:space="preserve">EMBARGOS DE DECLARAÇÃO. PROCESSUAL CIVIL. VÍCIOS PREVISTOS NO ART. 1.022 DO CPC. OMISSÃO. INEXISTÊNCIA. REDISCUSSÃO. IMPOSSIBILIDADE. […] PRECLUSÃO CONSUMATIVA. INOVAÇÃO RECURSAL. IMPOSSIBILIDADE. REJEIÇÃO. 1. Ausente a omissão apontada, ante a higidez e a clareza do julgado, e evidenciado o propósito de rediscutir a matéria apreciada pelo órgão julgador, os embargos de declaração devem ser rejeitados. 2. </w:t>
+      </w:r>
+      <w:r>
+        <w:rPr>
+          <w:b/>
+          <w:bCs/>
+          <w:u w:val="single"/>
+          <w:shd w:fill="CFE2F3" w:color="auto" w:val="clear"/>
+          <w:sz w:val="18"/>
+          <w:szCs w:val="18"/>
+        </w:rPr>
+        <w:t xml:space="preserve">É vedado inovar nas teses recursais por ocasião da oposição de embargos de declaração, devendo a matéria levantada constar, obrigatoriamente, das razões do recurso originário.</w:t>
+      </w:r>
+      <w:r>
+        <w:rPr>
+          <w:sz w:val="18"/>
+          <w:szCs w:val="18"/>
+        </w:rPr>
+        <w:t xml:space="preserve"> 3. Embargos de declaração rejeitados.</w:t>
+      </w:r>
+    </w:p>
+    <w:p>
+      <w:pPr>
+        <w:pBdr>
+          <w:bottom w:val="single" w:color="9AA0A6" w:sz="4" w:space="6"/>
+        </w:pBdr>
+        <w:spacing w:after="200" w:before="0" w:line="240"/>
+        <w:ind w:left="2270" w:right="570"/>
+        <w:jc w:val="both"/>
+      </w:pPr>
+      <w:r>
+        <w:rPr>
+          <w:sz w:val="18"/>
+          <w:szCs w:val="18"/>
+        </w:rPr>
+        <w:t xml:space="preserve">(TJMA - EMBDECCV 0006037-31.2016.8.10.0001 (0303192019), Rel. Des. Kleber Costa Carvalho, Primeira Câmara Cível, j. 31/10/2019)</w:t>
+      </w:r>
+    </w:p>
+    <w:p>
+      <w:pPr>
+        <w:spacing w:after="60" w:line="360"/>
+        <w:ind w:firstLine="850"/>
+        <w:jc w:val="both"/>
+      </w:pPr>
+      <w:r>
+        <w:t xml:space="preserve">A </w:t>
+      </w:r>
+      <w:r>
+        <w:rPr>
+          <w:i/>
+          <w:iCs/>
+        </w:rPr>
+        <w:t xml:space="preserve">ratio</w:t>
+      </w:r>
+      <w:r>
+        <w:t xml:space="preserve"> desses precedentes incide diretamente no caso: não há como o colegiado ter sido omisso sobre questão que jamais lhe foi apresentada. A alegação deve, portanto, ser </w:t>
+      </w:r>
+      <w:r>
+        <w:rPr>
+          <w:b/>
+          <w:bCs/>
+        </w:rPr>
+        <w:t xml:space="preserve">não conhecida</w:t>
+      </w:r>
+      <w:r>
+        <w:t xml:space="preserve">.</w:t>
       </w:r>
     </w:p>
     <w:p>
@@ -642,7 +858,7 @@
         <w:jc w:val="both"/>
       </w:pPr>
       <w:r>
-        <w:t xml:space="preserve">Ainda que assim não fosse, a alegação do embargante é desmentida pela própria sentença (ID 56302139). Embora tenha registrado, no relatório, “decorrido o prazo sem manifestação”, o Juízo de origem fundamentou o indeferimento na suposta “</w:t>
+        <w:t xml:space="preserve">Ainda que assim não fosse, a alegação do embargante é desmentida pela própria sentença. Embora tenha registrado, no relatório, “decorrido o prazo sem manifestação”, o Juízo de origem fundamentou o indeferimento na suposta “</w:t>
       </w:r>
       <w:r>
         <w:rPr>
@@ -662,7 +878,7 @@
         <w:jc w:val="both"/>
       </w:pPr>
       <w:r>
-        <w:t xml:space="preserve">Ocorre que a única fonte de informação sobre a movimentação bancária do apelante são justamente os </w:t>
+        <w:t xml:space="preserve">Ocorre que a única fonte de informação sobre a movimentação bancária do embargado são justamente os </w:t>
       </w:r>
       <w:r>
         <w:rPr>
@@ -672,7 +888,7 @@
         <w:t xml:space="preserve">extratos bancários juntados com a petição de 12/03/2026</w:t>
       </w:r>
       <w:r>
-        <w:t xml:space="preserve"> (IDs 56301585, 56301586 e 56301587). Isto é: o Juízo de origem recebeu e valorou os documentos, chegando apenas a conclusão equivocada sobre o seu conteúdo — conclusão essa que o acórdão corretamente afastou ao reconhecer que os extratos revelam “</w:t>
+        <w:t xml:space="preserve"> (IDs 56301585, 56301586 e 56301587). Isto é: o Juízo de origem recebeu e valorou os documentos, chegando apenas a conclusão equivocada sobre o seu conteúdo — conclusão que o acórdão corretamente afastou ao reconhecer que os extratos revelam “</w:t>
       </w:r>
       <w:r>
         <w:rPr>
@@ -759,7 +975,7 @@
         <w:t xml:space="preserve">concedeu diretamente a gratuidade da justiça</w:t>
       </w:r>
       <w:r>
-        <w:t xml:space="preserve"> ao apelante.</w:t>
+        <w:t xml:space="preserve"> ao embargado.</w:t>
       </w:r>
     </w:p>
     <w:p>
@@ -789,17 +1005,7 @@
         <w:jc w:val="both"/>
       </w:pPr>
       <w:r>
-        <w:t xml:space="preserve">Por isso, ainda que se cogitasse de algum atraso — o que se admite apenas para argumentar —, o resultado do julgamento seria rigorosamente o mesmo: concedida a gratuidade, desaparece a única causa da extinção (a ausência de recolhimento das custas iniciais), e os autos devem retornar à origem para regular processamento.</w:t>
-      </w:r>
-    </w:p>
-    <w:p>
-      <w:pPr>
-        <w:spacing w:after="60" w:line="360"/>
-        <w:ind w:firstLine="850"/>
-        <w:jc w:val="both"/>
-      </w:pPr>
-      <w:r>
-        <w:t xml:space="preserve">O art. 489, § 1º, IV, do CPC, invocado pelo embargante, exige o enfrentamento apenas dos argumentos “</w:t>
+        <w:t xml:space="preserve">Por isso, ainda que se cogitasse de algum atraso — o que se admite apenas para argumentar —, o resultado do julgamento seria rigorosamente o mesmo: concedida a gratuidade, desaparece a única causa da extinção (a ausência de recolhimento das custas iniciais). O art. 489, § 1º, IV, do CPC, invocado pelo embargante, exige o enfrentamento apenas dos argumentos “</w:t>
       </w:r>
       <w:r>
         <w:rPr>
@@ -809,7 +1015,7 @@
         <w:t xml:space="preserve">capazes de, em tese, infirmar a conclusão adotada pelo julgador</w:t>
       </w:r>
       <w:r>
-        <w:t xml:space="preserve">”. Argumento que, mesmo acolhido, não alteraria o resultado não se enquadra nessa hipótese.</w:t>
+        <w:t xml:space="preserve">”, o que não é o caso.</w:t>
       </w:r>
     </w:p>
     <w:p>
@@ -876,7 +1082,17 @@
         <w:t xml:space="preserve">mais de um mês antes da sentença</w:t>
       </w:r>
       <w:r>
-        <w:t xml:space="preserve">, como registrou o acórdão, e estavam à disposição do Juízo quando da prolação da decisão. Desconsiderá-los por mero apego à contagem do prazo violaria os princípios da primazia do julgamento de mérito, da cooperação e da instrumentalidade das formas (arts. 4º, 6º, 139, IX, e 317 do CPC), sobretudo em processo cujo resultado foi a extinção sem resolução do mérito de demanda que visa proteger a posse de bem de terceiro adquirente de boa-fé.</w:t>
+        <w:t xml:space="preserve">, como registrou o acórdão, e estavam à disposição do Juízo quando da prolação da decisão. Desconsiderá-los por mero apego à contagem do prazo violaria os princípios da primazia do julgamento de mérito, da cooperação e da instrumentalidade das formas (arts. 4º, 6º, 139, IX, e 317 do CPC).</w:t>
+      </w:r>
+    </w:p>
+    <w:p>
+      <w:pPr>
+        <w:spacing w:after="60" w:line="360"/>
+        <w:ind w:firstLine="850"/>
+        <w:jc w:val="both"/>
+      </w:pPr>
+      <w:r>
+        <w:t xml:space="preserve">Ademais, a extinção pretendida pelo Banco sequer resolveria a controvérsia: o pronunciamento que não resolve o mérito não obsta a repropositura da ação (art. 486 do CPC). O único efeito prático seria retardar a prestação jurisdicional e obrigar o terceiro a repropor demanda destinada à proteção do mesmo bem, com novo pedido de gratuidade fundado nos mesmos documentos — resultado incompatível com a eficiência e a duração razoável do processo (art. 5º, LXXVIII, da CF e art. 4º do CPC).</w:t>
       </w:r>
     </w:p>
     <w:p>
@@ -965,16 +1181,6 @@
     </w:p>
     <w:p>
       <w:pPr>
-        <w:spacing w:after="60" w:line="360"/>
-        <w:ind w:firstLine="850"/>
-        <w:jc w:val="both"/>
-      </w:pPr>
-      <w:r>
-        <w:t xml:space="preserve">Em qualquer hipótese, a apuração da data de intimação e a contagem do prazo dependeriam do reexame de matéria fática que não foi controvertida no recurso, o que extrapola os estreitos limites dos embargos de declaração.</w:t>
-      </w:r>
-    </w:p>
-    <w:p>
-      <w:pPr>
         <w:shd w:fill="123BB8" w:color="auto" w:val="clear"/>
         <w:tabs>
           <w:tab w:val="left" w:pos="1000"/>
@@ -1000,7 +1206,7 @@
           <w:iCs/>
           <w:color w:val="FFFFFF"/>
         </w:rPr>
-        <w:t xml:space="preserve">V. Do descabimento dos efeitos infringentes e do prequestionamento.</w:t>
+        <w:t xml:space="preserve">V. Da inadequação dos embargos para rediscussão do julgamento.</w:t>
       </w:r>
     </w:p>
     <w:p>
@@ -1030,17 +1236,69 @@
         <w:t xml:space="preserve">confirmação</w:t>
       </w:r>
       <w:r>
-        <w:t xml:space="preserve"> do provimento da apelação. Quanto ao mais, o pedido condicional de efeitos infringentes (“caso […] seja constatado que a manifestação foi apresentada fora do prazo”) revela o verdadeiro propósito do recurso: rediscutir o mérito do julgado a partir de tese nova, o que não se admite.</w:t>
-      </w:r>
-    </w:p>
-    <w:p>
-      <w:pPr>
-        <w:spacing w:after="60" w:line="360"/>
-        <w:ind w:firstLine="850"/>
-        <w:jc w:val="both"/>
-      </w:pPr>
-      <w:r>
-        <w:t xml:space="preserve">Quanto ao prequestionamento, o art. 1.025 do CPC já considera incluídos no acórdão os elementos suscitados pelo embargante para fins de prequestionamento, ainda que os embargos sejam rejeitados, de modo que o pedido não justifica qualquer modificação do julgado.</w:t>
+        <w:t xml:space="preserve"> do provimento da apelação. Quanto ao mais, o pedido condicional de efeitos infringentes (“caso […] seja constatado que a manifestação foi apresentada fora do prazo”) revela o verdadeiro propósito do recurso: substituir a conclusão do Colegiado por aquela defendida pelo Banco, mediante nova valoração do prazo e dos documentos financeiros. Esta Corte já rechaçou essa pretensão:</w:t>
+      </w:r>
+    </w:p>
+    <w:p>
+      <w:pPr>
+        <w:pBdr>
+          <w:top w:val="single" w:color="9AA0A6" w:sz="4" w:space="6"/>
+        </w:pBdr>
+        <w:spacing w:after="0" w:before="160" w:line="240"/>
+        <w:ind w:left="2270" w:right="570"/>
+        <w:jc w:val="both"/>
+      </w:pPr>
+      <w:r>
+        <w:rPr>
+          <w:sz w:val="18"/>
+          <w:szCs w:val="18"/>
+        </w:rPr>
+        <w:t xml:space="preserve">PROCESSUAL CIVIL. EMBARGOS DE DECLARAÇÃO. OMISSÃO, CONTRADIÇÃO, OBSCURIDADE INEXISTENTES. […] REDISCUSSÃO DA MATÉRIA. PROPÓSITO PROTELATÓRIO. REEXAME DE MATÉRIA. IMPOSSIBILIDADE. […] III - Na verdade, trata-se de irresignação do embargante, </w:t>
+      </w:r>
+      <w:r>
+        <w:rPr>
+          <w:b/>
+          <w:bCs/>
+          <w:u w:val="single"/>
+          <w:shd w:fill="CFE2F3" w:color="auto" w:val="clear"/>
+          <w:sz w:val="18"/>
+          <w:szCs w:val="18"/>
+        </w:rPr>
+        <w:t xml:space="preserve">buscando por meio destes aclaratórios a reapreciação de matéria alegada, e já decidida quando do julgamento da apelação cível, o que não é cabível em sede de embargos de declaração.</w:t>
+      </w:r>
+      <w:r>
+        <w:rPr>
+          <w:sz w:val="18"/>
+          <w:szCs w:val="18"/>
+        </w:rPr>
+        <w:t xml:space="preserve"> IV - Embargos de declaração conhecidos e rejeitados.</w:t>
+      </w:r>
+    </w:p>
+    <w:p>
+      <w:pPr>
+        <w:pBdr>
+          <w:bottom w:val="single" w:color="9AA0A6" w:sz="4" w:space="6"/>
+        </w:pBdr>
+        <w:spacing w:after="200" w:before="0" w:line="240"/>
+        <w:ind w:left="2270" w:right="570"/>
+        <w:jc w:val="both"/>
+      </w:pPr>
+      <w:r>
+        <w:rPr>
+          <w:sz w:val="18"/>
+          <w:szCs w:val="18"/>
+        </w:rPr>
+        <w:t xml:space="preserve">(TJMA - ED 0025867-51.2014.8.10.0001 (0102702016), Rel. Des. Raimundo José Barros de Sousa, Quinta Câmara Cível, j. 23/05/2016, DJe 24/05/2016)</w:t>
+      </w:r>
+    </w:p>
+    <w:p>
+      <w:pPr>
+        <w:spacing w:after="60" w:line="360"/>
+        <w:ind w:firstLine="850"/>
+        <w:jc w:val="both"/>
+      </w:pPr>
+      <w:r>
+        <w:t xml:space="preserve">Quanto ao prequestionamento, o art. 1.025 do CPC já considera incluídos no acórdão os elementos suscitados pelo embargante, ainda que os embargos sejam rejeitados, de modo que o pedido não justifica qualquer modificação do julgado.</w:t>
       </w:r>
     </w:p>
     <w:p>
@@ -1070,95 +1328,254 @@
           <w:iCs/>
           <w:color w:val="FFFFFF"/>
         </w:rPr>
-        <w:t xml:space="preserve">VI. Dos pedidos.</w:t>
-      </w:r>
-    </w:p>
-    <w:p>
-      <w:pPr>
-        <w:spacing w:after="60" w:line="360"/>
-        <w:ind w:firstLine="850"/>
-        <w:jc w:val="both"/>
-      </w:pPr>
-      <w:r>
-        <w:t xml:space="preserve">Ante o exposto, requer o embargado:</w:t>
-      </w:r>
-    </w:p>
-    <w:p>
-      <w:pPr>
+        <w:t xml:space="preserve">VI. Do caráter protelatório quanto à alegada omissão.</w:t>
+      </w:r>
+    </w:p>
+    <w:p>
+      <w:pPr>
+        <w:spacing w:after="60" w:line="360"/>
+        <w:ind w:firstLine="850"/>
+        <w:jc w:val="both"/>
+      </w:pPr>
+      <w:r>
+        <w:t xml:space="preserve">Embora o apontamento do erro material seja procedente, a utilização dos embargos para introduzir tese não alegada oportunamente e buscar, por via transversa, o restabelecimento da sentença extintiva revela finalidade incompatível com a função integrativa do recurso, em processo cujo objeto é justamente impedir a apreensão de bem de terceiro.</w:t>
+      </w:r>
+    </w:p>
+    <w:p>
+      <w:pPr>
+        <w:spacing w:after="60" w:line="360"/>
+        <w:ind w:firstLine="850"/>
+        <w:jc w:val="both"/>
+      </w:pPr>
+      <w:r>
+        <w:t xml:space="preserve">Assim, caso o Colegiado entenda caracterizado o propósito manifestamente protelatório quanto a esse capítulo, requer-se a aplicação da multa prevista no art. 1.026, § 2º, do CPC.</w:t>
+      </w:r>
+    </w:p>
+    <w:p>
+      <w:pPr>
+        <w:shd w:fill="123BB8" w:color="auto" w:val="clear"/>
         <w:tabs>
           <w:tab w:val="left" w:pos="1000"/>
         </w:tabs>
-        <w:spacing w:after="60" w:line="360"/>
-        <w:ind w:left="1000" w:hanging="400"/>
-        <w:jc w:val="both"/>
-      </w:pPr>
-      <w:r>
-        <w:t xml:space="preserve">A.</w:t>
-      </w:r>
-      <w:r>
+        <w:spacing w:after="240" w:before="360" w:line="360"/>
+        <w:ind w:left="0"/>
+      </w:pPr>
+      <w:r>
+        <w:rPr>
+          <w:b/>
+          <w:bCs/>
+          <w:i/>
+          <w:iCs/>
+          <w:color w:val="FFFFFF"/>
+        </w:rPr>
         <w:tab/>
       </w:r>
       <w:r>
-        <w:t xml:space="preserve">o </w:t>
-      </w:r>
-      <w:r>
-        <w:rPr>
-          <w:b/>
-          <w:bCs/>
-        </w:rPr>
-        <w:t xml:space="preserve">acolhimento parcial</w:t>
-      </w:r>
-      <w:r>
-        <w:t xml:space="preserve"> dos embargos de declaração, </w:t>
-      </w:r>
-      <w:r>
-        <w:rPr>
-          <w:b/>
-          <w:bCs/>
-        </w:rPr>
-        <w:t xml:space="preserve">exclusivamente para a correção do erro material</w:t>
-      </w:r>
-      <w:r>
-        <w:t xml:space="preserve"> constante do dispositivo do acórdão, a fim de que passe a constar que a Terceira Câmara de Direito Privado, por unanimidade, </w:t>
-      </w:r>
-      <w:r>
-        <w:rPr>
-          <w:b/>
-          <w:bCs/>
-        </w:rPr>
-        <w:t xml:space="preserve">conheceu do recurso e, no mérito, deu-lhe provimento</w:t>
-      </w:r>
-      <w:r>
-        <w:t xml:space="preserve">, nos termos do voto do Relator, em conformidade com a ementa, o voto e a certidão de julgamento;</w:t>
-      </w:r>
-    </w:p>
-    <w:p>
-      <w:pPr>
+        <w:rPr>
+          <w:b/>
+          <w:bCs/>
+          <w:i/>
+          <w:iCs/>
+          <w:color w:val="FFFFFF"/>
+        </w:rPr>
+        <w:t xml:space="preserve">VII. Da tutela provisória para impedir a apreensão da Toyota Hilux.</w:t>
+      </w:r>
+    </w:p>
+    <w:p>
+      <w:pPr>
+        <w:spacing w:after="60" w:line="360"/>
+        <w:ind w:firstLine="850"/>
+        <w:jc w:val="both"/>
+      </w:pPr>
+      <w:r>
+        <w:t xml:space="preserve">Os embargos de terceiro têm por objeto a desconstituição da restrição judicial incidente sobre o veículo </w:t>
+      </w:r>
+      <w:r>
+        <w:rPr>
+          <w:b/>
+          <w:bCs/>
+        </w:rPr>
+        <w:t xml:space="preserve">Toyota Hilux CD 4x4 SR, placa MXD-1303</w:t>
+      </w:r>
+      <w:r>
+        <w:t xml:space="preserve">, adquirido de boa-fé pelo embargado antes da penhora realizada na execução nº 0801686-81.2021.8.10.0073, e que se encontra em sua posse.</w:t>
+      </w:r>
+    </w:p>
+    <w:p>
+      <w:pPr>
+        <w:spacing w:after="60" w:line="360"/>
+        <w:ind w:firstLine="850"/>
+        <w:jc w:val="both"/>
+      </w:pPr>
+      <w:r>
+        <w:rPr>
+          <w:b/>
+          <w:bCs/>
+          <w:shd w:fill="FFF200" w:color="auto" w:val="clear"/>
+        </w:rPr>
+        <w:t xml:space="preserve">[DESCREVER O FATO NOVO: ordem/mandado de busca e apreensão ou remoção expedido na execução nº 0801686-81.2021.8.10.0073 (ID ____, data __/__/2026), designação de leilão, etc.]</w:t>
+      </w:r>
+    </w:p>
+    <w:p>
+      <w:pPr>
+        <w:spacing w:after="60" w:line="360"/>
+        <w:ind w:firstLine="850"/>
+        <w:jc w:val="both"/>
+      </w:pPr>
+      <w:r>
+        <w:t xml:space="preserve">Enquanto pendente o julgamento destes embargos de declaração — e, por consequência, o retorno dos autos à origem determinado pelo acórdão —, os embargos de terceiro permanecem sem processamento, e o embargado fica exposto à apreensão do veículo antes mesmo de ter a sua pretensão examinada, o que esvaziaria a utilidade da demanda.</w:t>
+      </w:r>
+    </w:p>
+    <w:p>
+      <w:pPr>
+        <w:spacing w:after="60" w:line="360"/>
+        <w:ind w:firstLine="850"/>
+        <w:jc w:val="both"/>
+      </w:pPr>
+      <w:r>
+        <w:t xml:space="preserve">Nos recursos, a tutela provisória deve ser requerida ao órgão jurisdicional competente para apreciar o mérito (art. 299, parágrafo único, do CPC), incumbindo ao Relator apreciá-la (art. 932, II, do CPC). O art. 678 do CPC, por sua vez, determina a suspensão das medidas constritivas sobre os bens litigiosos quando suficientemente provado o domínio ou a posse, admitindo a manutenção provisória da posse em favor do embargante.</w:t>
+      </w:r>
+    </w:p>
+    <w:p>
+      <w:pPr>
+        <w:spacing w:after="60" w:line="360"/>
+        <w:ind w:firstLine="850"/>
+        <w:jc w:val="both"/>
+      </w:pPr>
+      <w:r>
+        <w:t xml:space="preserve">Estão presentes os requisitos do art. 300 do CPC. A </w:t>
+      </w:r>
+      <w:r>
+        <w:rPr>
+          <w:b/>
+          <w:bCs/>
+        </w:rPr>
+        <w:t xml:space="preserve">probabilidade do direito</w:t>
+      </w:r>
+      <w:r>
+        <w:t xml:space="preserve"> decorre da documentação que instrui a inicial, relativa à aquisição e à posse do veículo, e do próprio acórdão, que reconheceu o direito do embargado ao regular processamento da demanda. O </w:t>
+      </w:r>
+      <w:r>
+        <w:rPr>
+          <w:b/>
+          <w:bCs/>
+        </w:rPr>
+        <w:t xml:space="preserve">perigo de dano</w:t>
+      </w:r>
+      <w:r>
+        <w:t xml:space="preserve"> é evidente: a apreensão e a remoção do veículo privariam o embargado do bem que utiliza e poderiam conduzir à sua alienação judicial antes do julgamento, tornando inútil o provimento final. A medida, ademais, é plenamente reversível.</w:t>
+      </w:r>
+    </w:p>
+    <w:p>
+      <w:pPr>
+        <w:spacing w:after="60" w:line="360"/>
+        <w:ind w:firstLine="850"/>
+        <w:jc w:val="both"/>
+      </w:pPr>
+      <w:r>
+        <w:t xml:space="preserve">A jurisprudência deste Tribunal reconhece a proteção do terceiro adquirente de boa-fé contra a apreensão de veículo:</w:t>
+      </w:r>
+    </w:p>
+    <w:p>
+      <w:pPr>
+        <w:pBdr>
+          <w:top w:val="single" w:color="9AA0A6" w:sz="4" w:space="6"/>
+        </w:pBdr>
+        <w:spacing w:after="0" w:before="160" w:line="240"/>
+        <w:ind w:left="2270" w:right="570"/>
+        <w:jc w:val="both"/>
+      </w:pPr>
+      <w:r>
+        <w:rPr>
+          <w:sz w:val="18"/>
+          <w:szCs w:val="18"/>
+        </w:rPr>
+        <w:t xml:space="preserve">APELAÇÃO CÍVEL. EMBARGOS DE TERCEIRO. AÇÃO DE BUSCA E APREENSÃO. VEÍCULO ADQUIRIDO EM LEILÃO REALIZADO PELO DETRAN/MA. ADQUIRENTE DE BOA-FÉ. REVOGAÇÃO DA LIMINAR DE BUSCA DO BEM. […] 1. Se comprovadamente o terceiro arrematou o veículo em leilão promovido pela Administração Pública e recebeu documento sem que houvesse restrição nos cadastros do DETRAN do Estado do Maranhão, deduz-se que corretamente se subsumiu ao caso o disposto no art. 1046 do CPC, </w:t>
+      </w:r>
+      <w:r>
+        <w:rPr>
+          <w:b/>
+          <w:bCs/>
+          <w:u w:val="single"/>
+          <w:shd w:fill="CFE2F3" w:color="auto" w:val="clear"/>
+          <w:sz w:val="18"/>
+          <w:szCs w:val="18"/>
+        </w:rPr>
+        <w:t xml:space="preserve">cassando-se a liminar de busca e apreensão e restituindo o bem à posse do terceiro que o adquiriu de boa-fé.</w:t>
+      </w:r>
+      <w:r>
+        <w:rPr>
+          <w:sz w:val="18"/>
+          <w:szCs w:val="18"/>
+        </w:rPr>
+        <w:t xml:space="preserve"> […] 3. Apelação cível conhecida e improvida. 4. Unanimidade.</w:t>
+      </w:r>
+    </w:p>
+    <w:p>
+      <w:pPr>
+        <w:pBdr>
+          <w:bottom w:val="single" w:color="9AA0A6" w:sz="4" w:space="6"/>
+        </w:pBdr>
+        <w:spacing w:after="200" w:before="0" w:line="240"/>
+        <w:ind w:left="2270" w:right="570"/>
+        <w:jc w:val="both"/>
+      </w:pPr>
+      <w:r>
+        <w:rPr>
+          <w:sz w:val="18"/>
+          <w:szCs w:val="18"/>
+        </w:rPr>
+        <w:t xml:space="preserve">(TJMA - APL 0014035-89.2012.8.10.0001 (0305232015), Rel. Des. Ricardo Tadeu Bugarin Duailibe, Quinta Câmara Cível, j. 25/01/2016, DJe 16/02/2016)</w:t>
+      </w:r>
+    </w:p>
+    <w:p>
+      <w:pPr>
+        <w:spacing w:after="60" w:line="360"/>
+        <w:ind w:firstLine="850"/>
+        <w:jc w:val="both"/>
+      </w:pPr>
+      <w:r>
+        <w:t xml:space="preserve">Requer-se, portanto, a concessão de tutela provisória, com apreciação imediata pelo Relator, para determinar a suspensão de qualquer ato de busca, apreensão, remoção ou alienação do veículo, até o julgamento dos embargos de terceiro, mantendo-se o embargado na posse do bem.</w:t>
+      </w:r>
+    </w:p>
+    <w:p>
+      <w:pPr>
+        <w:shd w:fill="123BB8" w:color="auto" w:val="clear"/>
         <w:tabs>
           <w:tab w:val="left" w:pos="1000"/>
         </w:tabs>
-        <w:spacing w:after="60" w:line="360"/>
-        <w:ind w:left="1000" w:hanging="400"/>
-        <w:jc w:val="both"/>
-      </w:pPr>
-      <w:r>
-        <w:t xml:space="preserve">B.</w:t>
-      </w:r>
-      <w:r>
+        <w:spacing w:after="240" w:before="360" w:line="360"/>
+        <w:ind w:left="0"/>
+      </w:pPr>
+      <w:r>
+        <w:rPr>
+          <w:b/>
+          <w:bCs/>
+          <w:i/>
+          <w:iCs/>
+          <w:color w:val="FFFFFF"/>
+        </w:rPr>
         <w:tab/>
       </w:r>
       <w:r>
-        <w:t xml:space="preserve">a </w:t>
-      </w:r>
-      <w:r>
-        <w:rPr>
-          <w:b/>
-          <w:bCs/>
-        </w:rPr>
-        <w:t xml:space="preserve">rejeição</w:t>
-      </w:r>
-      <w:r>
-        <w:t xml:space="preserve"> dos embargos quanto à alegada omissão sobre a tempestividade da petição de 12/03/2026, por tratar-se de inovação recursal e de questão incapaz de infirmar a conclusão do julgado, que se sustenta em fundamento autônomo;</w:t>
+        <w:rPr>
+          <w:b/>
+          <w:bCs/>
+          <w:i/>
+          <w:iCs/>
+          <w:color w:val="FFFFFF"/>
+        </w:rPr>
+        <w:t xml:space="preserve">VIII. Dos pedidos.</w:t>
+      </w:r>
+    </w:p>
+    <w:p>
+      <w:pPr>
+        <w:spacing w:after="60" w:line="360"/>
+        <w:ind w:firstLine="850"/>
+        <w:jc w:val="both"/>
+      </w:pPr>
+      <w:r>
+        <w:t xml:space="preserve">Ante o exposto, requer o embargado:</w:t>
       </w:r>
     </w:p>
     <w:p>
@@ -1171,6 +1588,84 @@
         <w:jc w:val="both"/>
       </w:pPr>
       <w:r>
+        <w:t xml:space="preserve">A.</w:t>
+      </w:r>
+      <w:r>
+        <w:tab/>
+      </w:r>
+      <w:r>
+        <w:t xml:space="preserve">a </w:t>
+      </w:r>
+      <w:r>
+        <w:rPr>
+          <w:b/>
+          <w:bCs/>
+        </w:rPr>
+        <w:t xml:space="preserve">concessão imediata, pelo Relator, da tutela provisória</w:t>
+      </w:r>
+      <w:r>
+        <w:t xml:space="preserve"> (arts. 299, parágrafo único, 300, 678 e 932, II, do CPC), para suspender qualquer ato de busca, apreensão, remoção ou alienação da Toyota Hilux CD 4x4 SR, placa MXD-1303, mantendo-se o embargado na posse do bem até o julgamento dos embargos de terceiro, com comunicação ao Juízo da execução nº 0801686-81.2021.8.10.0073;</w:t>
+      </w:r>
+    </w:p>
+    <w:p>
+      <w:pPr>
+        <w:tabs>
+          <w:tab w:val="left" w:pos="1000"/>
+        </w:tabs>
+        <w:spacing w:after="60" w:line="360"/>
+        <w:ind w:left="1000" w:hanging="400"/>
+        <w:jc w:val="both"/>
+      </w:pPr>
+      <w:r>
+        <w:t xml:space="preserve">B.</w:t>
+      </w:r>
+      <w:r>
+        <w:tab/>
+      </w:r>
+      <w:r>
+        <w:t xml:space="preserve">o </w:t>
+      </w:r>
+      <w:r>
+        <w:rPr>
+          <w:b/>
+          <w:bCs/>
+        </w:rPr>
+        <w:t xml:space="preserve">acolhimento parcial</w:t>
+      </w:r>
+      <w:r>
+        <w:t xml:space="preserve"> dos embargos de declaração, </w:t>
+      </w:r>
+      <w:r>
+        <w:rPr>
+          <w:b/>
+          <w:bCs/>
+        </w:rPr>
+        <w:t xml:space="preserve">exclusivamente para a correção do erro material</w:t>
+      </w:r>
+      <w:r>
+        <w:t xml:space="preserve"> constante do dispositivo do acórdão, a fim de que passe a constar que a Terceira Câmara de Direito Privado, por unanimidade, </w:t>
+      </w:r>
+      <w:r>
+        <w:rPr>
+          <w:b/>
+          <w:bCs/>
+        </w:rPr>
+        <w:t xml:space="preserve">conheceu do recurso e, no mérito, deu-lhe provimento</w:t>
+      </w:r>
+      <w:r>
+        <w:t xml:space="preserve">, nos termos do voto do Relator;</w:t>
+      </w:r>
+    </w:p>
+    <w:p>
+      <w:pPr>
+        <w:tabs>
+          <w:tab w:val="left" w:pos="1000"/>
+        </w:tabs>
+        <w:spacing w:after="60" w:line="360"/>
+        <w:ind w:left="1000" w:hanging="400"/>
+        <w:jc w:val="both"/>
+      </w:pPr>
+      <w:r>
         <w:t xml:space="preserve">C.</w:t>
       </w:r>
       <w:r>
@@ -1184,10 +1679,68 @@
           <w:b/>
           <w:bCs/>
         </w:rPr>
+        <w:t xml:space="preserve">não conhecimento</w:t>
+      </w:r>
+      <w:r>
+        <w:t xml:space="preserve"> da alegação de omissão quanto à tempestividade da petição de 12/03/2026, por configurar inovação recursal alcançada pela preclusão consumativa, e, subsidiariamente, a sua </w:t>
+      </w:r>
+      <w:r>
+        <w:rPr>
+          <w:b/>
+          <w:bCs/>
+        </w:rPr>
+        <w:t xml:space="preserve">rejeição</w:t>
+      </w:r>
+      <w:r>
+        <w:t xml:space="preserve">, por inexistir omissão e por subsistir fundamento autônomo e suficiente no acórdão;</w:t>
+      </w:r>
+    </w:p>
+    <w:p>
+      <w:pPr>
+        <w:tabs>
+          <w:tab w:val="left" w:pos="1000"/>
+        </w:tabs>
+        <w:spacing w:after="60" w:line="360"/>
+        <w:ind w:left="1000" w:hanging="400"/>
+        <w:jc w:val="both"/>
+      </w:pPr>
+      <w:r>
+        <w:t xml:space="preserve">D.</w:t>
+      </w:r>
+      <w:r>
+        <w:tab/>
+      </w:r>
+      <w:r>
+        <w:t xml:space="preserve">o </w:t>
+      </w:r>
+      <w:r>
+        <w:rPr>
+          <w:b/>
+          <w:bCs/>
+        </w:rPr>
         <w:t xml:space="preserve">indeferimento do pedido de efeitos infringentes</w:t>
       </w:r>
       <w:r>
-        <w:t xml:space="preserve">, mantendo-se integralmente o acórdão que reformou a sentença, concedeu a gratuidade da justiça ao embargado e determinou o retorno dos autos à origem para regular prosseguimento do feito.</w:t>
+        <w:t xml:space="preserve">, mantendo-se integralmente o acórdão que reformou a sentença, concedeu a gratuidade da justiça ao embargado e determinou o retorno dos autos à origem para regular prosseguimento do feito;</w:t>
+      </w:r>
+    </w:p>
+    <w:p>
+      <w:pPr>
+        <w:tabs>
+          <w:tab w:val="left" w:pos="1000"/>
+        </w:tabs>
+        <w:spacing w:after="60" w:line="360"/>
+        <w:ind w:left="1000" w:hanging="400"/>
+        <w:jc w:val="both"/>
+      </w:pPr>
+      <w:r>
+        <w:t xml:space="preserve">E.</w:t>
+      </w:r>
+      <w:r>
+        <w:tab/>
+      </w:r>
+      <w:r>
+        <w:t xml:space="preserve">caso o Colegiado entenda caracterizado o propósito manifestamente protelatório, a aplicação ao embargante da multa prevista no art. 1.026, § 2º, do CPC.</w:t>
       </w:r>
     </w:p>
     <w:p>

</xml_diff>

<commit_message>
Contrarrazões aos embargos (v3): remove tese de tempestividade e reforça ausência de preclusão
Co-Authored-By: Claude Opus 5.5 <noreply@anthropic.com>
Claude-Session: https://claude.ai/code/session_01HGwRciqyTiQSvfsnHtndrt
</commit_message>
<xml_diff>
--- a/0800052-74.2026 - Jorge Marques/Contrarrazões aos Embargos de Declaração - Jorge Marques de Araújo.docx
+++ b/0800052-74.2026 - Jorge Marques/Contrarrazões aos Embargos de Declaração - Jorge Marques de Araújo.docx
@@ -1052,7 +1052,7 @@
           <w:i/>
           <w:iCs/>
         </w:rPr>
-        <w:t xml:space="preserve">O prazo assinalado não era peremptório:</w:t>
+        <w:t xml:space="preserve">O prazo assinalado não era peremptório e não gera preclusão do direito à gratuidade:</w:t>
       </w:r>
     </w:p>
     <w:p>
@@ -1072,6 +1072,26 @@
         <w:jc w:val="both"/>
       </w:pPr>
       <w:r>
+        <w:t xml:space="preserve">Também não incide, na espécie, a preclusão temporal do art. 223 do CPC. O direito à gratuidade não se exaure em prazo processual: o art. 99, § 1º, do CPC admite que o pedido seja formulado — e, portanto, comprovado — por simples petição a qualquer tempo, inclusive de forma superveniente. Ainda que se reputasse extemporânea a manifestação em relação ao prazo assinalado, os documentos nela contidos haveriam de ser recebidos e examinados como novo requerimento, nos termos daquele dispositivo, e conduziriam exatamente à mesma conclusão alcançada pelo acórdão.</w:t>
+      </w:r>
+    </w:p>
+    <w:p>
+      <w:pPr>
+        <w:spacing w:after="60" w:line="360"/>
+        <w:ind w:firstLine="850"/>
+        <w:jc w:val="both"/>
+      </w:pPr>
+      <w:r>
+        <w:t xml:space="preserve">Nem se diga que a sentença poderia simplesmente ignorá-los. A extinção do processo por ausência de recolhimento de custas pressupõe a recusa ou a inércia da parte, e não a existência, nos autos, de comprovação da hipossuficiência pendente de exame. Eventual descompasso mínimo em relação ao termo final do prazo — que em nada prejudicou o andamento do feito ou a parte contrária, sequer citada — não autoriza a sanção extrema de indeferimento da inicial, sob pena de ofensa à proporcionalidade e ao acesso à justiça (art. 5º, XXXV e LXXIV, da CF e art. 8º do CPC).</w:t>
+      </w:r>
+    </w:p>
+    <w:p>
+      <w:pPr>
+        <w:spacing w:after="60" w:line="360"/>
+        <w:ind w:firstLine="850"/>
+        <w:jc w:val="both"/>
+      </w:pPr>
+      <w:r>
         <w:t xml:space="preserve">Os documentos foram juntados </w:t>
       </w:r>
       <w:r>
@@ -1093,90 +1113,6 @@
       </w:pPr>
       <w:r>
         <w:t xml:space="preserve">Ademais, a extinção pretendida pelo Banco sequer resolveria a controvérsia: o pronunciamento que não resolve o mérito não obsta a repropositura da ação (art. 486 do CPC). O único efeito prático seria retardar a prestação jurisdicional e obrigar o terceiro a repropor demanda destinada à proteção do mesmo bem, com novo pedido de gratuidade fundado nos mesmos documentos — resultado incompatível com a eficiência e a duração razoável do processo (art. 5º, LXXVIII, da CF e art. 4º do CPC).</w:t>
-      </w:r>
-    </w:p>
-    <w:p>
-      <w:pPr>
-        <w:keepNext/>
-        <w:tabs>
-          <w:tab w:val="left" w:pos="700"/>
-        </w:tabs>
-        <w:spacing w:after="160" w:before="240" w:line="360"/>
-        <w:ind w:left="700" w:hanging="400"/>
-      </w:pPr>
-      <w:r>
-        <w:rPr>
-          <w:b/>
-          <w:bCs/>
-          <w:i/>
-          <w:iCs/>
-        </w:rPr>
-        <w:t xml:space="preserve">e.</w:t>
-      </w:r>
-      <w:r>
-        <w:rPr>
-          <w:b/>
-          <w:bCs/>
-          <w:i/>
-          <w:iCs/>
-        </w:rPr>
-        <w:tab/>
-      </w:r>
-      <w:r>
-        <w:rPr>
-          <w:b/>
-          <w:bCs/>
-          <w:i/>
-          <w:iCs/>
-        </w:rPr>
-        <w:t xml:space="preserve">A tempestividade da petição de 12/03/2026:</w:t>
-      </w:r>
-    </w:p>
-    <w:p>
-      <w:pPr>
-        <w:spacing w:after="60" w:line="360"/>
-        <w:ind w:firstLine="850"/>
-        <w:jc w:val="both"/>
-      </w:pPr>
-      <w:r>
-        <w:rPr>
-          <w:b/>
-          <w:bCs/>
-          <w:shd w:fill="FFF200" w:color="auto" w:val="clear"/>
-        </w:rPr>
-        <w:t xml:space="preserve">[CONFERIR NA ABA “EXPEDIENTES” DO PJe ANTES DO PROTOCOLO — manter este tópico somente se a contagem confirmar a tempestividade; caso contrário, suprimi-lo.]</w:t>
-      </w:r>
-    </w:p>
-    <w:p>
-      <w:pPr>
-        <w:spacing w:after="60" w:line="360"/>
-        <w:ind w:firstLine="850"/>
-        <w:jc w:val="both"/>
-      </w:pPr>
-      <w:r>
-        <w:t xml:space="preserve">De todo modo, a manifestação foi tempestiva. </w:t>
-      </w:r>
-      <w:r>
-        <w:rPr>
-          <w:b/>
-          <w:bCs/>
-          <w:shd w:fill="FFF200" w:color="auto" w:val="clear"/>
-        </w:rPr>
-        <w:t xml:space="preserve">O despacho de 05/02/2026 (ID 56301575) foi objeto de intimação eletrônica pelo sistema PJe, expedida em __/02/2026, com ciência registrada em __/02/2026 (art. 5º, § 3º, da Lei nº 11.419/2006).</w:t>
-      </w:r>
-      <w:r>
-        <w:t xml:space="preserve"> Excluído o dia do começo e computados apenas os dias úteis (arts. 219 e 224 do CPC), e desconsiderados os dias sem expediente forense do período de Carnaval (16 a 18/02/2026), </w:t>
-      </w:r>
-      <w:r>
-        <w:rPr>
-          <w:b/>
-          <w:bCs/>
-          <w:shd w:fill="FFF200" w:color="auto" w:val="clear"/>
-        </w:rPr>
-        <w:t xml:space="preserve">o prazo de 15 dias iniciou-se em __/02/2026 e encerrou-se em 12/03/2026</w:t>
-      </w:r>
-      <w:r>
-        <w:t xml:space="preserve">, data em que foi protocolada a petição de ID 56301580.</w:t>
       </w:r>
     </w:p>
     <w:p>

</xml_diff>

<commit_message>
Contrarrazões aos embargos: sincroniza com a versão final revisada pelo escritório
Co-Authored-By: Claude Opus 5.5 <noreply@anthropic.com>
Claude-Session: https://claude.ai/code/session_01HGwRciqyTiQSvfsnHtndrt
</commit_message>
<xml_diff>
--- a/0800052-74.2026 - Jorge Marques/Contrarrazões aos Embargos de Declaração - Jorge Marques de Araújo.docx
+++ b/0800052-74.2026 - Jorge Marques/Contrarrazões aos Embargos de Declaração - Jorge Marques de Araújo.docx
@@ -133,7 +133,7 @@
           <w:b/>
           <w:bCs/>
         </w:rPr>
-        <w:t xml:space="preserve">C O N T R A R R A Z Õ E S   A O S   E M B A R G O S   D E   D E C L A R A Ç Ã O</w:t>
+        <w:t xml:space="preserve">CONTRARRAZÕES AOS EMBARGOS DE DECLARAÇÃO</w:t>
       </w:r>
     </w:p>
     <w:p>
@@ -203,24 +203,6 @@
     </w:p>
     <w:p>
       <w:pPr>
-        <w:spacing w:after="60" w:line="360"/>
-        <w:ind w:firstLine="850"/>
-        <w:jc w:val="both"/>
-      </w:pPr>
-      <w:r>
-        <w:rPr>
-          <w:b/>
-          <w:bCs/>
-          <w:shd w:fill="FFF200" w:color="auto" w:val="clear"/>
-        </w:rPr>
-        <w:t xml:space="preserve">A intimação do embargado ocorreu em __/__/2026 (ID ________). Excluído o dia do começo e computados apenas os dias úteis (arts. 219 e 224 do CPC), o prazo encerra-se em __/__/2026,</w:t>
-      </w:r>
-      <w:r>
-        <w:t xml:space="preserve"> sendo tempestiva a presente manifestação.</w:t>
-      </w:r>
-    </w:p>
-    <w:p>
-      <w:pPr>
         <w:shd w:fill="123BB8" w:color="auto" w:val="clear"/>
         <w:tabs>
           <w:tab w:val="left" w:pos="1000"/>
@@ -296,7 +278,7 @@
         <w:t xml:space="preserve">contradição</w:t>
       </w:r>
       <w:r>
-        <w:t xml:space="preserve"> entre a ementa, o voto e a certidão de julgamento — que registram o provimento do recurso — e o dispositivo formal, que contém a expressão “negar-lhe provimento”. De outro, pretende transformar em </w:t>
+        <w:t xml:space="preserve"> entre a ementa, o voto e a certidão de julgamento, que registram o provimento do recurso, e o dispositivo formal, que contém a expressão “negar-lhe provimento”. De outro, pretende transformar em </w:t>
       </w:r>
       <w:r>
         <w:rPr>
@@ -326,7 +308,7 @@
         <w:t xml:space="preserve">erro material</w:t>
       </w:r>
       <w:r>
-        <w:t xml:space="preserve">, que apenas confirma o resultado proclamado em favor do embargado. A segunda não configura omissão: traduz tentativa de introduzir fundamento novo e rediscutir matéria já decidida, o que é vedado na via eleita.</w:t>
+        <w:t xml:space="preserve">, que apenas confirma o resultado proclamado em favor do embargado. A segunda não configura omissão, traduz tentativa de introduzir fundamento novo e rediscutir matéria já decidida, o que é vedado na via eleita.</w:t>
       </w:r>
     </w:p>
     <w:p>
@@ -426,7 +408,7 @@
         <w:t xml:space="preserve">erro material</w:t>
       </w:r>
       <w:r>
-        <w:t xml:space="preserve">, e não de contradição na formação do convencimento do colegiado. A correção pode ser feita a qualquer tempo, inclusive de ofício (arts. 494, I, e 1.022, III, do CPC), e deve limitar-se a adequar o dispositivo ao resultado efetivamente proclamado — provimento da apelação, concessão da gratuidade e retorno dos autos à origem —, sem reabrir o mérito ou restabelecer a sentença.</w:t>
+        <w:t xml:space="preserve">, e não de contradição na formação do convencimento do colegiado. A correção pode ser feita a qualquer tempo, inclusive de ofício (arts. 494, I, e 1.022, III, do CPC), e deve limitar-se a adequar o dispositivo ao resultado efetivamente proclamado, provimento da apelação, concessão da gratuidade e retorno dos autos à origem, sem reabrir o mérito ou restabelecer a sentença.</w:t>
       </w:r>
     </w:p>
     <w:p>
@@ -585,7 +567,7 @@
         <w:jc w:val="both"/>
       </w:pPr>
       <w:r>
-        <w:t xml:space="preserve">O próprio embargante, aliás, dedicou parte das contrarrazões a valorar o conteúdo dos extratos apresentados — afirmando que “</w:t>
+        <w:t xml:space="preserve">O próprio embargante, aliás, dedicou parte das contrarrazões a valorar o conteúdo dos extratos apresentados, afirmando que “</w:t>
       </w:r>
       <w:r>
         <w:rPr>
@@ -595,7 +577,7 @@
         <w:t xml:space="preserve">a análise da capacidade econômica não se limita ao saldo existente em determinado dia ou mês</w:t>
       </w:r>
       <w:r>
-        <w:t xml:space="preserve">” —, o que pressupõe a admissão de que tais documentos integravam validamente os autos.</w:t>
+        <w:t xml:space="preserve">”, o que pressupõe a admissão de que tais documentos integravam validamente os autos.</w:t>
       </w:r>
     </w:p>
     <w:p>
@@ -888,7 +870,7 @@
         <w:t xml:space="preserve">extratos bancários juntados com a petição de 12/03/2026</w:t>
       </w:r>
       <w:r>
-        <w:t xml:space="preserve"> (IDs 56301585, 56301586 e 56301587). Isto é: o Juízo de origem recebeu e valorou os documentos, chegando apenas a conclusão equivocada sobre o seu conteúdo — conclusão que o acórdão corretamente afastou ao reconhecer que os extratos revelam “</w:t>
+        <w:t xml:space="preserve"> (IDs 56301585, 56301586 e 56301587). Isto é: o Juízo de origem recebeu e valorou os documentos, chegando apenas a conclusão equivocada sobre o seu conteúdo, conclusão que o acórdão corretamente afastou ao reconhecer que os extratos revelam “</w:t>
       </w:r>
       <w:r>
         <w:rPr>
@@ -955,7 +937,7 @@
         <w:jc w:val="both"/>
       </w:pPr>
       <w:r>
-        <w:t xml:space="preserve">O embargante sustenta que a tempestividade da petição seria “premissa determinante” do julgado. Não é. O acórdão reformou a sentença por </w:t>
+        <w:t xml:space="preserve">O embargante sustenta que a tempestividade da petição seria “premissa determinante” do julgado. Contudo, o acórdão reformou a sentença por </w:t>
       </w:r>
       <w:r>
         <w:rPr>
@@ -1005,7 +987,7 @@
         <w:jc w:val="both"/>
       </w:pPr>
       <w:r>
-        <w:t xml:space="preserve">Por isso, ainda que se cogitasse de algum atraso — o que se admite apenas para argumentar —, o resultado do julgamento seria rigorosamente o mesmo: concedida a gratuidade, desaparece a única causa da extinção (a ausência de recolhimento das custas iniciais). O art. 489, § 1º, IV, do CPC, invocado pelo embargante, exige o enfrentamento apenas dos argumentos “</w:t>
+        <w:t xml:space="preserve">Por isso, ainda que se cogitasse de algum atraso, o que se admite apenas para argumentar, o resultado do julgamento seria rigorosamente o mesmo, concedida a gratuidade, desaparece a única causa da extinção (a ausência de recolhimento das custas iniciais). O art. 489, § 1º, IV, do CPC, invocado pelo embargante, exige o enfrentamento apenas dos argumentos “</w:t>
       </w:r>
       <w:r>
         <w:rPr>
@@ -1052,37 +1034,17 @@
           <w:i/>
           <w:iCs/>
         </w:rPr>
-        <w:t xml:space="preserve">O prazo assinalado não era peremptório e não gera preclusão do direito à gratuidade:</w:t>
-      </w:r>
-    </w:p>
-    <w:p>
-      <w:pPr>
-        <w:spacing w:after="60" w:line="360"/>
-        <w:ind w:firstLine="850"/>
-        <w:jc w:val="both"/>
-      </w:pPr>
-      <w:r>
-        <w:t xml:space="preserve">Acrescente-se que o prazo fixado no despacho de 05/02/2026 é prazo judicial, de natureza dilatória, destinado a viabilizar a comprovação dos pressupostos da gratuidade, na forma do art. 99, § 2º, do CPC. Sua finalidade é cooperativa: permitir que o juiz decida com base em elementos concretos, e não punir a parte com a perda do direito ao benefício.</w:t>
-      </w:r>
-    </w:p>
-    <w:p>
-      <w:pPr>
-        <w:spacing w:after="60" w:line="360"/>
-        <w:ind w:firstLine="850"/>
-        <w:jc w:val="both"/>
-      </w:pPr>
-      <w:r>
-        <w:t xml:space="preserve">Também não incide, na espécie, a preclusão temporal do art. 223 do CPC. O direito à gratuidade não se exaure em prazo processual: o art. 99, § 1º, do CPC admite que o pedido seja formulado — e, portanto, comprovado — por simples petição a qualquer tempo, inclusive de forma superveniente. Ainda que se reputasse extemporânea a manifestação em relação ao prazo assinalado, os documentos nela contidos haveriam de ser recebidos e examinados como novo requerimento, nos termos daquele dispositivo, e conduziriam exatamente à mesma conclusão alcançada pelo acórdão.</w:t>
-      </w:r>
-    </w:p>
-    <w:p>
-      <w:pPr>
-        <w:spacing w:after="60" w:line="360"/>
-        <w:ind w:firstLine="850"/>
-        <w:jc w:val="both"/>
-      </w:pPr>
-      <w:r>
-        <w:t xml:space="preserve">Nem se diga que a sentença poderia simplesmente ignorá-los. A extinção do processo por ausência de recolhimento de custas pressupõe a recusa ou a inércia da parte, e não a existência, nos autos, de comprovação da hipossuficiência pendente de exame. Eventual descompasso mínimo em relação ao termo final do prazo — que em nada prejudicou o andamento do feito ou a parte contrária, sequer citada — não autoriza a sanção extrema de indeferimento da inicial, sob pena de ofensa à proporcionalidade e ao acesso à justiça (art. 5º, XXXV e LXXIV, da CF e art. 8º do CPC).</w:t>
+        <w:t xml:space="preserve">O prazo assinalado não era peremptório:</w:t>
+      </w:r>
+    </w:p>
+    <w:p>
+      <w:pPr>
+        <w:spacing w:after="60" w:line="360"/>
+        <w:ind w:firstLine="850"/>
+        <w:jc w:val="both"/>
+      </w:pPr>
+      <w:r>
+        <w:t xml:space="preserve">Acrescente-se que o prazo fixado no despacho de 05/02/2026 é prazo judicial, de natureza dilatória, destinado a viabilizar a comprovação dos pressupostos da gratuidade, na forma do art. 99, § 2º, do CPC. Sua finalidade é cooperativa, permitir que o juiz decida com base em elementos concretos, e não punir a parte com a perda do direito ao benefício.</w:t>
       </w:r>
     </w:p>
     <w:p>
@@ -1112,7 +1074,7 @@
         <w:jc w:val="both"/>
       </w:pPr>
       <w:r>
-        <w:t xml:space="preserve">Ademais, a extinção pretendida pelo Banco sequer resolveria a controvérsia: o pronunciamento que não resolve o mérito não obsta a repropositura da ação (art. 486 do CPC). O único efeito prático seria retardar a prestação jurisdicional e obrigar o terceiro a repropor demanda destinada à proteção do mesmo bem, com novo pedido de gratuidade fundado nos mesmos documentos — resultado incompatível com a eficiência e a duração razoável do processo (art. 5º, LXXVIII, da CF e art. 4º do CPC).</w:t>
+        <w:t xml:space="preserve">Ademais, a extinção pretendida pelo Banco sequer resolveria a controvérsia: o pronunciamento que não resolve o mérito não obsta a repropositura da ação (art. 486 do CPC). O único efeito prático seria retardar a prestação jurisdicional e obrigar o terceiro a repropor demanda destinada à proteção do mesmo bem, com novo pedido de gratuidade fundado nos mesmos documentos, resultado incompatível com a eficiência e a duração razoável do processo (art. 5º, LXXVIII, da CF e art. 4º do CPC).</w:t>
       </w:r>
     </w:p>
     <w:p>
@@ -1162,7 +1124,7 @@
         <w:jc w:val="both"/>
       </w:pPr>
       <w:r>
-        <w:t xml:space="preserve">No caso, o único vício existente — o erro material no dispositivo — conduz justamente à </w:t>
+        <w:t xml:space="preserve">No caso, o único vício existente conduz justamente à </w:t>
       </w:r>
       <w:r>
         <w:rPr>
@@ -1172,7 +1134,7 @@
         <w:t xml:space="preserve">confirmação</w:t>
       </w:r>
       <w:r>
-        <w:t xml:space="preserve"> do provimento da apelação. Quanto ao mais, o pedido condicional de efeitos infringentes (“caso […] seja constatado que a manifestação foi apresentada fora do prazo”) revela o verdadeiro propósito do recurso: substituir a conclusão do Colegiado por aquela defendida pelo Banco, mediante nova valoração do prazo e dos documentos financeiros. Esta Corte já rechaçou essa pretensão:</w:t>
+        <w:t xml:space="preserve"> do provimento da apelação. Quanto ao mais, o pedido condicional de efeitos infringentes (“caso […] seja constatado que a manifestação foi apresentada fora do prazo”) revela o verdadeiro propósito do recurso, substituir a conclusão do Colegiado por aquela defendida pelo Banco, mediante nova valoração do prazo e dos documentos financeiros. Esta Corte já rechaçou essa pretensão:</w:t>
       </w:r>
     </w:p>
     <w:p>
@@ -1344,22 +1306,7 @@
         <w:jc w:val="both"/>
       </w:pPr>
       <w:r>
-        <w:rPr>
-          <w:b/>
-          <w:bCs/>
-          <w:shd w:fill="FFF200" w:color="auto" w:val="clear"/>
-        </w:rPr>
-        <w:t xml:space="preserve">[DESCREVER O FATO NOVO: ordem/mandado de busca e apreensão ou remoção expedido na execução nº 0801686-81.2021.8.10.0073 (ID ____, data __/__/2026), designação de leilão, etc.]</w:t>
-      </w:r>
-    </w:p>
-    <w:p>
-      <w:pPr>
-        <w:spacing w:after="60" w:line="360"/>
-        <w:ind w:firstLine="850"/>
-        <w:jc w:val="both"/>
-      </w:pPr>
-      <w:r>
-        <w:t xml:space="preserve">Enquanto pendente o julgamento destes embargos de declaração — e, por consequência, o retorno dos autos à origem determinado pelo acórdão —, os embargos de terceiro permanecem sem processamento, e o embargado fica exposto à apreensão do veículo antes mesmo de ter a sua pretensão examinada, o que esvaziaria a utilidade da demanda.</w:t>
+        <w:t xml:space="preserve">Enquanto pendente o julgamento destes embargos de declaração, os embargos de terceiro permanecem sem processamento, e o embargado fica exposto à apreensão do veículo antes mesmo de ter a sua pretensão examinada, o que esvaziaria a utilidade da demanda.</w:t>
       </w:r>
     </w:p>
     <w:p>
@@ -1399,7 +1346,7 @@
         <w:t xml:space="preserve">perigo de dano</w:t>
       </w:r>
       <w:r>
-        <w:t xml:space="preserve"> é evidente: a apreensão e a remoção do veículo privariam o embargado do bem que utiliza e poderiam conduzir à sua alienação judicial antes do julgamento, tornando inútil o provimento final. A medida, ademais, é plenamente reversível.</w:t>
+        <w:t xml:space="preserve"> é evidente, a apreensão e a remoção do veículo privariam o embargado do bem que utiliza e poderiam conduzir à sua alienação judicial antes do julgamento, tornando inútil o provimento final. A medida, ademais, é plenamente reversível.</w:t>
       </w:r>
     </w:p>
     <w:p>

</xml_diff>